<commit_message>
Update Game Design Document Abstract
Revised the Game Design Document Abstract. Details of the changes are in the updated .docx file.
</commit_message>
<xml_diff>
--- a/GDD/Game Design Document Abstract.docx
+++ b/GDD/Game Design Document Abstract.docx
@@ -7,12 +7,22 @@
         <w:pStyle w:val="Heading1"/>
       </w:pPr>
       <w:r>
-        <w:t>Game Design Document (Abstract)</w:t>
+        <w:t>Game Design Document</w:t>
+      </w:r>
+      <w:r>
+        <w:t xml:space="preserve"> – Exit Strat</w:t>
+      </w:r>
+      <w:r>
+        <w:t>egy (FPS Maze)</w:t>
       </w:r>
     </w:p>
     <w:p>
       <w:r>
         <w:t>Title: Exit Strategy</w:t>
+      </w:r>
+      <w:r>
+        <w:br/>
+        <w:t>Engine: C++ with OpenGL</w:t>
       </w:r>
       <w:r>
         <w:rPr>
@@ -22,15 +32,29 @@
         <w:br/>
       </w:r>
       <w:r>
-        <w:t>Genre: First-Person Action-Adventure (combat, stealth, puzzle)</w:t>
+        <w:t xml:space="preserve">Genre: First-Person </w:t>
+      </w:r>
+      <w:r>
+        <w:t>Maze Survival</w:t>
       </w:r>
       <w:r>
         <w:br/>
         <w:t>Platform: PC</w:t>
       </w:r>
       <w:r>
+        <w:t xml:space="preserve"> (Mouse + Keyboard)</w:t>
+      </w:r>
+      <w:r>
         <w:br/>
-        <w:t>Target Audience: 16 above, indie/retro gamers, fans of GTA-style mission structure.</w:t>
+      </w:r>
+      <w:r>
+        <w:t>Genre: First-Person Maze Survival / Stealth Chase</w:t>
+      </w:r>
+      <w:r>
+        <w:br/>
+      </w:r>
+      <w:r>
+        <w:t>Target Scope: Small, polished, fully playable demo</w:t>
       </w:r>
     </w:p>
     <w:p>
@@ -50,127 +74,55 @@
         <w:t>Exit Strategy</w:t>
       </w:r>
       <w:r>
-        <w:t xml:space="preserve"> is a first-person mini open-world action-adventure game that places the player in a quarantined township and requires a series of missions to be accomplished by NPCs to help the player survive, learn why the township is on lockdown and how to</w:t>
-      </w:r>
-      <w:r>
-        <w:rPr>
-          <w:rFonts w:hint="eastAsia"/>
-        </w:rPr>
-        <w:t xml:space="preserve"> escape. </w:t>
-      </w:r>
-    </w:p>
-    <w:p>
-      <w:r>
-        <w:rPr>
-          <w:rFonts w:hint="eastAsia"/>
-        </w:rPr>
-        <w:t xml:space="preserve">The game loop </w:t>
-      </w:r>
-      <w:r>
-        <w:t>follows</w:t>
-      </w:r>
-      <w:r>
-        <w:t>:</w:t>
+        <w:t xml:space="preserve"> is a first-person </w:t>
+      </w:r>
+      <w:r>
+        <w:t xml:space="preserve">maze survival game </w:t>
+      </w:r>
+      <w:r>
+        <w:t>where the player must navigate a series of labyrinths, collect Exit Keys, avoid patrolling NPC Guards, and escape through a locked Exit Gate.</w:t>
+      </w:r>
+    </w:p>
+    <w:p>
+      <w:r>
+        <w:t>The game is inspired by Pac-Man’s chase mechanics but redesigned as an FPS stealth experience. The player must make quick decisions, stay hidden, and plan routes to survive.</w:t>
+      </w:r>
+    </w:p>
+    <w:p>
+      <w:r>
+        <w:t>The maze is part of a military testing simulation called The Maze Grid</w:t>
+      </w:r>
+      <w:r>
+        <w:t>,</w:t>
+      </w:r>
+      <w:r>
+        <w:t xml:space="preserve"> a controlled environment designed to assess the player’s ability to escape under pressure.</w:t>
+      </w:r>
+    </w:p>
+    <w:p>
+      <w:r>
+        <w:t>The objective is simple:</w:t>
       </w:r>
       <w:r>
         <w:br/>
       </w:r>
-      <w:r>
-        <w:rPr>
-          <w:rFonts w:hint="eastAsia"/>
-        </w:rPr>
-        <w:t xml:space="preserve">Hub </w:t>
-      </w:r>
-      <w:r>
-        <w:rPr>
-          <w:rFonts w:hint="eastAsia"/>
-        </w:rPr>
-        <w:t>→</w:t>
-      </w:r>
-      <w:r>
-        <w:rPr>
-          <w:rFonts w:hint="eastAsia"/>
-        </w:rPr>
-        <w:t xml:space="preserve"> NPC </w:t>
-      </w:r>
-      <w:r>
-        <w:rPr>
-          <w:rFonts w:hint="eastAsia"/>
-        </w:rPr>
-        <w:t>→</w:t>
-      </w:r>
-      <w:r>
-        <w:rPr>
-          <w:rFonts w:hint="eastAsia"/>
-        </w:rPr>
-        <w:t xml:space="preserve"> Mission </w:t>
-      </w:r>
-      <w:r>
-        <w:rPr>
-          <w:rFonts w:hint="eastAsia"/>
-        </w:rPr>
-        <w:t>→</w:t>
-      </w:r>
-      <w:r>
-        <w:rPr>
-          <w:rFonts w:hint="eastAsia"/>
-        </w:rPr>
-        <w:t xml:space="preserve"> Completion </w:t>
-      </w:r>
-      <w:r>
-        <w:rPr>
-          <w:rFonts w:hint="eastAsia"/>
-        </w:rPr>
-        <w:t>→</w:t>
-      </w:r>
-      <w:r>
-        <w:rPr>
-          <w:rFonts w:hint="eastAsia"/>
-        </w:rPr>
-        <w:t xml:space="preserve"> Return for Progression</w:t>
-      </w:r>
-    </w:p>
-    <w:p>
-      <w:pPr>
-        <w:pStyle w:val="Heading2"/>
-      </w:pPr>
-      <w:r>
-        <w:t>Player Fantasy &amp; Experience</w:t>
-      </w:r>
-    </w:p>
-    <w:p>
-      <w:r>
-        <w:t>Players feel empowered and survive under pressure. They begin as a lowly delivery man but learn through missions and quests, crafting equipment, and levelling up skills. Emotional moments consist of suspense (stealth/combat), intrigue (exploration/puzzles), and ethical decision-making (branching endings).</w:t>
-      </w:r>
-    </w:p>
-    <w:p>
-      <w:pPr>
-        <w:pStyle w:val="Heading2"/>
-      </w:pPr>
-      <w:r>
-        <w:t>Game</w:t>
-      </w:r>
-      <w:r>
-        <w:t xml:space="preserve"> Features</w:t>
-      </w:r>
-    </w:p>
-    <w:p>
-      <w:pPr>
-        <w:pStyle w:val="ListParagraph"/>
-        <w:numPr>
-          <w:ilvl w:val="0"/>
-          <w:numId w:val="1"/>
-        </w:numPr>
-      </w:pPr>
       <w:r>
         <w:rPr>
           <w:b/>
           <w:bCs/>
         </w:rPr>
-        <w:t>Mini Open World Hub</w:t>
-      </w:r>
-      <w:r>
-        <w:t>: Main square with NPCs directing players to 4 mission areas.</w:t>
+        <w:t>Collect the keys. Outsmart the guards. Find the exit.</w:t>
+      </w:r>
+    </w:p>
+    <w:p>
+      <w:pPr>
+        <w:pStyle w:val="Heading2"/>
+      </w:pPr>
+      <w:r>
+        <w:t xml:space="preserve">Core </w:t>
+      </w:r>
+      <w:r>
+        <w:t>Gameplay Loop</w:t>
       </w:r>
     </w:p>
     <w:p>
@@ -178,81 +130,14 @@
         <w:pStyle w:val="ListParagraph"/>
         <w:numPr>
           <w:ilvl w:val="0"/>
-          <w:numId w:val="1"/>
+          <w:numId w:val="5"/>
         </w:numPr>
       </w:pPr>
       <w:r>
-        <w:rPr>
-          <w:b/>
-          <w:bCs/>
-        </w:rPr>
-        <w:t>Mission Types</w:t>
-      </w:r>
-      <w:r>
-        <w:t>:</w:t>
-      </w:r>
-    </w:p>
-    <w:p>
-      <w:pPr>
-        <w:pStyle w:val="ListParagraph"/>
-        <w:numPr>
-          <w:ilvl w:val="1"/>
-          <w:numId w:val="1"/>
-        </w:numPr>
-      </w:pPr>
-      <w:r>
-        <w:t>Combat tutorial (Warehouse).</w:t>
-      </w:r>
-    </w:p>
-    <w:p>
-      <w:pPr>
-        <w:pStyle w:val="ListParagraph"/>
-        <w:numPr>
-          <w:ilvl w:val="1"/>
-          <w:numId w:val="1"/>
-        </w:numPr>
-      </w:pPr>
-      <w:r>
-        <w:t>Stealth mission in the forest.</w:t>
-      </w:r>
-    </w:p>
-    <w:p>
-      <w:pPr>
-        <w:pStyle w:val="ListParagraph"/>
-        <w:numPr>
-          <w:ilvl w:val="1"/>
-          <w:numId w:val="1"/>
-        </w:numPr>
-      </w:pPr>
-      <w:r>
-        <w:t xml:space="preserve">Puzzle + </w:t>
-      </w:r>
-      <w:r>
-        <w:t>combat mission (sabotage) in the Factory.</w:t>
-      </w:r>
-    </w:p>
-    <w:p>
-      <w:pPr>
-        <w:pStyle w:val="ListParagraph"/>
-        <w:numPr>
-          <w:ilvl w:val="1"/>
-          <w:numId w:val="1"/>
-        </w:numPr>
-      </w:pPr>
-      <w:r>
-        <w:t>Optional side quest.</w:t>
-      </w:r>
-    </w:p>
-    <w:p>
-      <w:pPr>
-        <w:pStyle w:val="ListParagraph"/>
-        <w:numPr>
-          <w:ilvl w:val="1"/>
-          <w:numId w:val="1"/>
-        </w:numPr>
-      </w:pPr>
-      <w:r>
-        <w:t>Final boss</w:t>
+        <w:t>Player</w:t>
+      </w:r>
+      <w:r>
+        <w:t xml:space="preserve"> spawn inside a maze.</w:t>
       </w:r>
     </w:p>
     <w:p>
@@ -260,18 +145,11 @@
         <w:pStyle w:val="ListParagraph"/>
         <w:numPr>
           <w:ilvl w:val="0"/>
-          <w:numId w:val="1"/>
+          <w:numId w:val="5"/>
         </w:numPr>
       </w:pPr>
       <w:r>
-        <w:rPr>
-          <w:b/>
-          <w:bCs/>
-        </w:rPr>
-        <w:t>Quest Progression Loop</w:t>
-      </w:r>
-      <w:r>
-        <w:t>: Each quest completed opens new areas, NPCs, and story.</w:t>
+        <w:t>Collect Exit Keys patrolling the maze.</w:t>
       </w:r>
     </w:p>
     <w:p>
@@ -279,98 +157,11 @@
         <w:pStyle w:val="ListParagraph"/>
         <w:numPr>
           <w:ilvl w:val="0"/>
-          <w:numId w:val="1"/>
+          <w:numId w:val="5"/>
         </w:numPr>
       </w:pPr>
       <w:r>
-        <w:rPr>
-          <w:b/>
-          <w:bCs/>
-        </w:rPr>
-        <w:t>Low Poly Design</w:t>
-      </w:r>
-      <w:r>
-        <w:t xml:space="preserve">: </w:t>
-      </w:r>
-      <w:r>
-        <w:t>Inspired by early 3D aesthetics for performance and style.</w:t>
-      </w:r>
-    </w:p>
-    <w:p>
-      <w:pPr>
-        <w:pStyle w:val="Heading2"/>
-      </w:pPr>
-      <w:r>
-        <w:t>Story Design</w:t>
-      </w:r>
-    </w:p>
-    <w:p>
-      <w:r>
-        <w:t>Act 1 – The Missing Crate (Combat Tutorial)</w:t>
-      </w:r>
-      <w:r>
-        <w:t>:</w:t>
-      </w:r>
-      <w:r>
-        <w:br/>
-      </w:r>
-      <w:r>
-        <w:t>The player retrieves a stolen supply crate from looters in an abandoned warehouse. This establishes the courier’s role as someone trying to survive while helping the local community. Completing this mission earns the player their first weapon and trust from the Merchant.</w:t>
-      </w:r>
-    </w:p>
-    <w:p>
-      <w:r>
-        <w:lastRenderedPageBreak/>
-        <w:t>Act 2 – The Watchers in the Woods (Stealth Mission)</w:t>
-      </w:r>
-      <w:r>
-        <w:t>:</w:t>
-      </w:r>
-      <w:r>
-        <w:br/>
-      </w:r>
-      <w:r>
-        <w:t>Strange movement is reported near the quarantine fence. The player scouts the forest, discovering cut wire and evidence of unknown groups trying to breach the perimeter. This mission builds tension and hints that the town is not isolated by accident.</w:t>
-      </w:r>
-    </w:p>
-    <w:p>
-      <w:r>
-        <w:t>Act 3 – Smoke and Steel (Puzzle + Combat Mission)</w:t>
-      </w:r>
-      <w:r>
-        <w:t>:</w:t>
-      </w:r>
-      <w:r>
-        <w:br/>
-      </w:r>
-      <w:r>
-        <w:t>Toxic gas spreads across the district due to a failing industrial facility. The player must shut down the ventilation system through a combination of puzzle-solving and combat. This mission shows how the district is collapsing from within and how infrastructure is failing.</w:t>
-      </w:r>
-    </w:p>
-    <w:p>
-      <w:r>
-        <w:t xml:space="preserve">Act </w:t>
-      </w:r>
-      <w:r>
-        <w:t>4</w:t>
-      </w:r>
-      <w:r>
-        <w:t xml:space="preserve"> – Exit Strategy (Final Mission)</w:t>
-      </w:r>
-      <w:r>
-        <w:t>:</w:t>
-      </w:r>
-      <w:r>
-        <w:br/>
-      </w:r>
-      <w:r>
-        <w:t xml:space="preserve">With the district days away from destruction, the player must decide whether to escape alone, help the remaining survivors </w:t>
-      </w:r>
-      <w:r>
-        <w:t>evacuate or</w:t>
-      </w:r>
-      <w:r>
-        <w:t xml:space="preserve"> stay and defend them. This mission leads into one of three endings:</w:t>
+        <w:t>Avoid NPC Guards patrolling the maze.</w:t>
       </w:r>
     </w:p>
     <w:p>
@@ -378,11 +169,14 @@
         <w:pStyle w:val="ListParagraph"/>
         <w:numPr>
           <w:ilvl w:val="0"/>
-          <w:numId w:val="4"/>
+          <w:numId w:val="5"/>
         </w:numPr>
       </w:pPr>
       <w:r>
-        <w:t>Selfish Ending – escape alone.</w:t>
+        <w:t>Use Power</w:t>
+      </w:r>
+      <w:r>
+        <w:t xml:space="preserve"> Cells to temporarily stun/blind the guards if spotted.</w:t>
       </w:r>
     </w:p>
     <w:p>
@@ -390,11 +184,11 @@
         <w:pStyle w:val="ListParagraph"/>
         <w:numPr>
           <w:ilvl w:val="0"/>
-          <w:numId w:val="4"/>
+          <w:numId w:val="5"/>
         </w:numPr>
       </w:pPr>
       <w:r>
-        <w:t>Heroic Ending – stay and sacrifice or barely survive.</w:t>
+        <w:t>After all keys are collected, the Exit Gate unlocks.</w:t>
       </w:r>
     </w:p>
     <w:p>
@@ -402,11 +196,224 @@
         <w:pStyle w:val="ListParagraph"/>
         <w:numPr>
           <w:ilvl w:val="0"/>
-          <w:numId w:val="4"/>
+          <w:numId w:val="5"/>
         </w:numPr>
       </w:pPr>
       <w:r>
-        <w:t>Balanced Ending – help civilians escape and survive with them.</w:t>
+        <w:t>Reach the Exit Gate to complete the level.</w:t>
+      </w:r>
+    </w:p>
+    <w:p>
+      <w:r>
+        <w:t>The loop is tight, repeatable, and easy to expand across multiple levels.</w:t>
+      </w:r>
+    </w:p>
+    <w:p>
+      <w:pPr>
+        <w:pStyle w:val="Heading2"/>
+      </w:pPr>
+      <w:r>
+        <w:t>Game</w:t>
+      </w:r>
+      <w:r>
+        <w:t xml:space="preserve"> </w:t>
+      </w:r>
+      <w:r>
+        <w:t>Mechanics</w:t>
+      </w:r>
+    </w:p>
+    <w:p>
+      <w:pPr>
+        <w:pStyle w:val="NoSpacing"/>
+      </w:pPr>
+      <w:r>
+        <w:t>Player</w:t>
+      </w:r>
+      <w:r>
+        <w:t>:</w:t>
+      </w:r>
+    </w:p>
+    <w:p>
+      <w:pPr>
+        <w:pStyle w:val="NoSpacing"/>
+        <w:numPr>
+          <w:ilvl w:val="0"/>
+          <w:numId w:val="6"/>
+        </w:numPr>
+      </w:pPr>
+      <w:r>
+        <w:t>First-person perspective</w:t>
+      </w:r>
+    </w:p>
+    <w:p>
+      <w:pPr>
+        <w:pStyle w:val="NoSpacing"/>
+        <w:numPr>
+          <w:ilvl w:val="0"/>
+          <w:numId w:val="6"/>
+        </w:numPr>
+      </w:pPr>
+      <w:r>
+        <w:t>WASD movement with mouse lock</w:t>
+      </w:r>
+    </w:p>
+    <w:p>
+      <w:pPr>
+        <w:pStyle w:val="NoSpacing"/>
+        <w:numPr>
+          <w:ilvl w:val="0"/>
+          <w:numId w:val="6"/>
+        </w:numPr>
+      </w:pPr>
+      <w:r>
+        <w:t>Sprint system</w:t>
+      </w:r>
+    </w:p>
+    <w:p>
+      <w:pPr>
+        <w:pStyle w:val="NoSpacing"/>
+        <w:numPr>
+          <w:ilvl w:val="0"/>
+          <w:numId w:val="6"/>
+        </w:numPr>
+      </w:pPr>
+      <w:r>
+        <w:t>AABB collision system</w:t>
+      </w:r>
+    </w:p>
+    <w:p>
+      <w:pPr>
+        <w:pStyle w:val="NoSpacing"/>
+        <w:numPr>
+          <w:ilvl w:val="0"/>
+          <w:numId w:val="6"/>
+        </w:numPr>
+      </w:pPr>
+      <w:r>
+        <w:t>Health system</w:t>
+      </w:r>
+    </w:p>
+    <w:p>
+      <w:pPr>
+        <w:pStyle w:val="NoSpacing"/>
+      </w:pPr>
+    </w:p>
+    <w:p>
+      <w:pPr>
+        <w:pStyle w:val="NoSpacing"/>
+      </w:pPr>
+    </w:p>
+    <w:p>
+      <w:pPr>
+        <w:pStyle w:val="NoSpacing"/>
+      </w:pPr>
+    </w:p>
+    <w:p>
+      <w:pPr>
+        <w:pStyle w:val="NoSpacing"/>
+      </w:pPr>
+      <w:r>
+        <w:lastRenderedPageBreak/>
+        <w:t>Maze</w:t>
+      </w:r>
+      <w:r>
+        <w:t>:</w:t>
+      </w:r>
+    </w:p>
+    <w:p>
+      <w:pPr>
+        <w:pStyle w:val="NoSpacing"/>
+        <w:numPr>
+          <w:ilvl w:val="0"/>
+          <w:numId w:val="7"/>
+        </w:numPr>
+      </w:pPr>
+      <w:r>
+        <w:t>Built from a 2D grid loaded via XML</w:t>
+      </w:r>
+    </w:p>
+    <w:p>
+      <w:pPr>
+        <w:pStyle w:val="NoSpacing"/>
+        <w:numPr>
+          <w:ilvl w:val="0"/>
+          <w:numId w:val="7"/>
+        </w:numPr>
+      </w:pPr>
+      <w:r>
+        <w:t>0 = wall</w:t>
+      </w:r>
+    </w:p>
+    <w:p>
+      <w:pPr>
+        <w:pStyle w:val="NoSpacing"/>
+        <w:numPr>
+          <w:ilvl w:val="0"/>
+          <w:numId w:val="7"/>
+        </w:numPr>
+      </w:pPr>
+      <w:r>
+        <w:t>1 = floor</w:t>
+      </w:r>
+    </w:p>
+    <w:p>
+      <w:pPr>
+        <w:pStyle w:val="NoSpacing"/>
+        <w:numPr>
+          <w:ilvl w:val="0"/>
+          <w:numId w:val="7"/>
+        </w:numPr>
+      </w:pPr>
+      <w:r>
+        <w:t>2 = player spawn</w:t>
+      </w:r>
+    </w:p>
+    <w:p>
+      <w:pPr>
+        <w:pStyle w:val="NoSpacing"/>
+        <w:numPr>
+          <w:ilvl w:val="0"/>
+          <w:numId w:val="7"/>
+        </w:numPr>
+      </w:pPr>
+      <w:r>
+        <w:t>3 = guard spawn</w:t>
+      </w:r>
+    </w:p>
+    <w:p>
+      <w:pPr>
+        <w:pStyle w:val="NoSpacing"/>
+        <w:numPr>
+          <w:ilvl w:val="0"/>
+          <w:numId w:val="7"/>
+        </w:numPr>
+      </w:pPr>
+      <w:r>
+        <w:t>4 = Exit Key</w:t>
+      </w:r>
+    </w:p>
+    <w:p>
+      <w:pPr>
+        <w:pStyle w:val="NoSpacing"/>
+        <w:numPr>
+          <w:ilvl w:val="0"/>
+          <w:numId w:val="7"/>
+        </w:numPr>
+      </w:pPr>
+      <w:r>
+        <w:t>5 = Power Cell</w:t>
+      </w:r>
+    </w:p>
+    <w:p>
+      <w:pPr>
+        <w:pStyle w:val="NoSpacing"/>
+        <w:numPr>
+          <w:ilvl w:val="0"/>
+          <w:numId w:val="7"/>
+        </w:numPr>
+      </w:pPr>
+      <w:r>
+        <w:t>Maze rendered as extruded 3D geometry with simple lighting</w:t>
       </w:r>
     </w:p>
     <w:p>
@@ -449,7 +456,13 @@
         <w:rPr>
           <w:rFonts w:hint="eastAsia"/>
         </w:rPr>
-        <w:t xml:space="preserve"> months (prototype hub </w:t>
+        <w:t xml:space="preserve"> months </w:t>
+      </w:r>
+      <w:r>
+        <w:rPr>
+          <w:rFonts w:hint="eastAsia"/>
+        </w:rPr>
+        <w:t xml:space="preserve">(core FPS movement </w:t>
       </w:r>
       <w:r>
         <w:rPr>
@@ -461,7 +474,7 @@
         <w:rPr>
           <w:rFonts w:hint="eastAsia"/>
         </w:rPr>
-        <w:t xml:space="preserve"> combat mission </w:t>
+        <w:t xml:space="preserve"> maze system </w:t>
       </w:r>
       <w:r>
         <w:rPr>
@@ -473,7 +486,7 @@
         <w:rPr>
           <w:rFonts w:hint="eastAsia"/>
         </w:rPr>
-        <w:t xml:space="preserve"> stealth mission </w:t>
+        <w:t xml:space="preserve"> NPC guard AI </w:t>
       </w:r>
       <w:r>
         <w:rPr>
@@ -485,7 +498,7 @@
         <w:rPr>
           <w:rFonts w:hint="eastAsia"/>
         </w:rPr>
-        <w:t xml:space="preserve"> puzzle mission </w:t>
+        <w:t xml:space="preserve"> pickups and exit condition </w:t>
       </w:r>
       <w:r>
         <w:rPr>
@@ -497,19 +510,7 @@
         <w:rPr>
           <w:rFonts w:hint="eastAsia"/>
         </w:rPr>
-        <w:t xml:space="preserve"> final escape/prototype </w:t>
-      </w:r>
-      <w:r>
-        <w:rPr>
-          <w:rFonts w:hint="eastAsia"/>
-        </w:rPr>
-        <w:t>→</w:t>
-      </w:r>
-      <w:r>
-        <w:rPr>
-          <w:rFonts w:hint="eastAsia"/>
-        </w:rPr>
-        <w:t xml:space="preserve"> polish)</w:t>
+        <w:t xml:space="preserve"> UI and polish)</w:t>
       </w:r>
     </w:p>
     <w:p>
@@ -528,7 +529,10 @@
         <w:t>Technical Feasibility</w:t>
       </w:r>
       <w:r>
-        <w:t>: Entirely built in OpenGL (GLFW/GLAD), easy AI (patrol/chase), FPS mechanics, simple puzzles.</w:t>
+        <w:t xml:space="preserve">: </w:t>
+      </w:r>
+      <w:r>
+        <w:t>Fully implemented in OpenGL using GLFW and GLAD. The project uses grid-based maze generation, first-person controls, and lightweight NPC guard AI with patrol and chase behaviours. Enemy logic is handled using a simple finite-state machine, ensuring the system remains performant and achievable within the timeframe.</w:t>
       </w:r>
     </w:p>
     <w:p>
@@ -547,10 +551,12 @@
         <w:t>Minimum Viable Product</w:t>
       </w:r>
       <w:r>
-        <w:t>: Hub + 1 mission + basic combat system.</w:t>
-      </w:r>
-    </w:p>
-    <w:p/>
+        <w:t xml:space="preserve">: </w:t>
+      </w:r>
+      <w:r>
+        <w:t>A playable FPS maze level featuring player movement, collectible Exit Keys, at least one NPC guard with patrol and chase behaviour, a Power Cell mechanic, and a functional Exit Gate to complete the level.</w:t>
+      </w:r>
+    </w:p>
     <w:sectPr>
       <w:pgSz w:w="11906" w:h="16838"/>
       <w:pgMar w:top="1440" w:right="1440" w:bottom="1440" w:left="1440" w:header="708" w:footer="708" w:gutter="0"/>
@@ -790,6 +796,119 @@
     </w:lvl>
   </w:abstractNum>
   <w:abstractNum w:abstractNumId="2" w15:restartNumberingAfterBreak="0">
+    <w:nsid w:val="51410030"/>
+    <w:multiLevelType w:val="hybridMultilevel"/>
+    <w:tmpl w:val="A084975E"/>
+    <w:lvl w:ilvl="0" w:tplc="08090001">
+      <w:start w:val="1"/>
+      <w:numFmt w:val="bullet"/>
+      <w:lvlText w:val=""/>
+      <w:lvlJc w:val="left"/>
+      <w:pPr>
+        <w:ind w:left="720" w:hanging="360"/>
+      </w:pPr>
+      <w:rPr>
+        <w:rFonts w:ascii="Symbol" w:hAnsi="Symbol" w:hint="default"/>
+      </w:rPr>
+    </w:lvl>
+    <w:lvl w:ilvl="1" w:tplc="08090003" w:tentative="1">
+      <w:start w:val="1"/>
+      <w:numFmt w:val="bullet"/>
+      <w:lvlText w:val="o"/>
+      <w:lvlJc w:val="left"/>
+      <w:pPr>
+        <w:ind w:left="1440" w:hanging="360"/>
+      </w:pPr>
+      <w:rPr>
+        <w:rFonts w:ascii="Courier New" w:hAnsi="Courier New" w:cs="Courier New" w:hint="default"/>
+      </w:rPr>
+    </w:lvl>
+    <w:lvl w:ilvl="2" w:tplc="08090005" w:tentative="1">
+      <w:start w:val="1"/>
+      <w:numFmt w:val="bullet"/>
+      <w:lvlText w:val=""/>
+      <w:lvlJc w:val="left"/>
+      <w:pPr>
+        <w:ind w:left="2160" w:hanging="360"/>
+      </w:pPr>
+      <w:rPr>
+        <w:rFonts w:ascii="Wingdings" w:hAnsi="Wingdings" w:hint="default"/>
+      </w:rPr>
+    </w:lvl>
+    <w:lvl w:ilvl="3" w:tplc="08090001" w:tentative="1">
+      <w:start w:val="1"/>
+      <w:numFmt w:val="bullet"/>
+      <w:lvlText w:val=""/>
+      <w:lvlJc w:val="left"/>
+      <w:pPr>
+        <w:ind w:left="2880" w:hanging="360"/>
+      </w:pPr>
+      <w:rPr>
+        <w:rFonts w:ascii="Symbol" w:hAnsi="Symbol" w:hint="default"/>
+      </w:rPr>
+    </w:lvl>
+    <w:lvl w:ilvl="4" w:tplc="08090003" w:tentative="1">
+      <w:start w:val="1"/>
+      <w:numFmt w:val="bullet"/>
+      <w:lvlText w:val="o"/>
+      <w:lvlJc w:val="left"/>
+      <w:pPr>
+        <w:ind w:left="3600" w:hanging="360"/>
+      </w:pPr>
+      <w:rPr>
+        <w:rFonts w:ascii="Courier New" w:hAnsi="Courier New" w:cs="Courier New" w:hint="default"/>
+      </w:rPr>
+    </w:lvl>
+    <w:lvl w:ilvl="5" w:tplc="08090005" w:tentative="1">
+      <w:start w:val="1"/>
+      <w:numFmt w:val="bullet"/>
+      <w:lvlText w:val=""/>
+      <w:lvlJc w:val="left"/>
+      <w:pPr>
+        <w:ind w:left="4320" w:hanging="360"/>
+      </w:pPr>
+      <w:rPr>
+        <w:rFonts w:ascii="Wingdings" w:hAnsi="Wingdings" w:hint="default"/>
+      </w:rPr>
+    </w:lvl>
+    <w:lvl w:ilvl="6" w:tplc="08090001" w:tentative="1">
+      <w:start w:val="1"/>
+      <w:numFmt w:val="bullet"/>
+      <w:lvlText w:val=""/>
+      <w:lvlJc w:val="left"/>
+      <w:pPr>
+        <w:ind w:left="5040" w:hanging="360"/>
+      </w:pPr>
+      <w:rPr>
+        <w:rFonts w:ascii="Symbol" w:hAnsi="Symbol" w:hint="default"/>
+      </w:rPr>
+    </w:lvl>
+    <w:lvl w:ilvl="7" w:tplc="08090003" w:tentative="1">
+      <w:start w:val="1"/>
+      <w:numFmt w:val="bullet"/>
+      <w:lvlText w:val="o"/>
+      <w:lvlJc w:val="left"/>
+      <w:pPr>
+        <w:ind w:left="5760" w:hanging="360"/>
+      </w:pPr>
+      <w:rPr>
+        <w:rFonts w:ascii="Courier New" w:hAnsi="Courier New" w:cs="Courier New" w:hint="default"/>
+      </w:rPr>
+    </w:lvl>
+    <w:lvl w:ilvl="8" w:tplc="08090005" w:tentative="1">
+      <w:start w:val="1"/>
+      <w:numFmt w:val="bullet"/>
+      <w:lvlText w:val=""/>
+      <w:lvlJc w:val="left"/>
+      <w:pPr>
+        <w:ind w:left="6480" w:hanging="360"/>
+      </w:pPr>
+      <w:rPr>
+        <w:rFonts w:ascii="Wingdings" w:hAnsi="Wingdings" w:hint="default"/>
+      </w:rPr>
+    </w:lvl>
+  </w:abstractNum>
+  <w:abstractNum w:abstractNumId="3" w15:restartNumberingAfterBreak="0">
     <w:nsid w:val="63980E65"/>
     <w:multiLevelType w:val="hybridMultilevel"/>
     <w:tmpl w:val="EEEEC746"/>
@@ -902,7 +1021,96 @@
       </w:rPr>
     </w:lvl>
   </w:abstractNum>
-  <w:abstractNum w:abstractNumId="3" w15:restartNumberingAfterBreak="0">
+  <w:abstractNum w:abstractNumId="4" w15:restartNumberingAfterBreak="0">
+    <w:nsid w:val="667D15A3"/>
+    <w:multiLevelType w:val="hybridMultilevel"/>
+    <w:tmpl w:val="986866A8"/>
+    <w:lvl w:ilvl="0" w:tplc="0809000F">
+      <w:start w:val="1"/>
+      <w:numFmt w:val="decimal"/>
+      <w:lvlText w:val="%1."/>
+      <w:lvlJc w:val="left"/>
+      <w:pPr>
+        <w:ind w:left="720" w:hanging="360"/>
+      </w:pPr>
+      <w:rPr>
+        <w:rFonts w:hint="default"/>
+      </w:rPr>
+    </w:lvl>
+    <w:lvl w:ilvl="1" w:tplc="08090019" w:tentative="1">
+      <w:start w:val="1"/>
+      <w:numFmt w:val="lowerLetter"/>
+      <w:lvlText w:val="%2."/>
+      <w:lvlJc w:val="left"/>
+      <w:pPr>
+        <w:ind w:left="1440" w:hanging="360"/>
+      </w:pPr>
+    </w:lvl>
+    <w:lvl w:ilvl="2" w:tplc="0809001B" w:tentative="1">
+      <w:start w:val="1"/>
+      <w:numFmt w:val="lowerRoman"/>
+      <w:lvlText w:val="%3."/>
+      <w:lvlJc w:val="right"/>
+      <w:pPr>
+        <w:ind w:left="2160" w:hanging="180"/>
+      </w:pPr>
+    </w:lvl>
+    <w:lvl w:ilvl="3" w:tplc="0809000F" w:tentative="1">
+      <w:start w:val="1"/>
+      <w:numFmt w:val="decimal"/>
+      <w:lvlText w:val="%4."/>
+      <w:lvlJc w:val="left"/>
+      <w:pPr>
+        <w:ind w:left="2880" w:hanging="360"/>
+      </w:pPr>
+    </w:lvl>
+    <w:lvl w:ilvl="4" w:tplc="08090019" w:tentative="1">
+      <w:start w:val="1"/>
+      <w:numFmt w:val="lowerLetter"/>
+      <w:lvlText w:val="%5."/>
+      <w:lvlJc w:val="left"/>
+      <w:pPr>
+        <w:ind w:left="3600" w:hanging="360"/>
+      </w:pPr>
+    </w:lvl>
+    <w:lvl w:ilvl="5" w:tplc="0809001B" w:tentative="1">
+      <w:start w:val="1"/>
+      <w:numFmt w:val="lowerRoman"/>
+      <w:lvlText w:val="%6."/>
+      <w:lvlJc w:val="right"/>
+      <w:pPr>
+        <w:ind w:left="4320" w:hanging="180"/>
+      </w:pPr>
+    </w:lvl>
+    <w:lvl w:ilvl="6" w:tplc="0809000F" w:tentative="1">
+      <w:start w:val="1"/>
+      <w:numFmt w:val="decimal"/>
+      <w:lvlText w:val="%7."/>
+      <w:lvlJc w:val="left"/>
+      <w:pPr>
+        <w:ind w:left="5040" w:hanging="360"/>
+      </w:pPr>
+    </w:lvl>
+    <w:lvl w:ilvl="7" w:tplc="08090019" w:tentative="1">
+      <w:start w:val="1"/>
+      <w:numFmt w:val="lowerLetter"/>
+      <w:lvlText w:val="%8."/>
+      <w:lvlJc w:val="left"/>
+      <w:pPr>
+        <w:ind w:left="5760" w:hanging="360"/>
+      </w:pPr>
+    </w:lvl>
+    <w:lvl w:ilvl="8" w:tplc="0809001B" w:tentative="1">
+      <w:start w:val="1"/>
+      <w:numFmt w:val="lowerRoman"/>
+      <w:lvlText w:val="%9."/>
+      <w:lvlJc w:val="right"/>
+      <w:pPr>
+        <w:ind w:left="6480" w:hanging="180"/>
+      </w:pPr>
+    </w:lvl>
+  </w:abstractNum>
+  <w:abstractNum w:abstractNumId="5" w15:restartNumberingAfterBreak="0">
     <w:nsid w:val="678361BF"/>
     <w:multiLevelType w:val="hybridMultilevel"/>
     <w:tmpl w:val="614C222A"/>
@@ -1015,17 +1223,139 @@
       </w:rPr>
     </w:lvl>
   </w:abstractNum>
+  <w:abstractNum w:abstractNumId="6" w15:restartNumberingAfterBreak="0">
+    <w:nsid w:val="70F6609C"/>
+    <w:multiLevelType w:val="hybridMultilevel"/>
+    <w:tmpl w:val="0E66BD96"/>
+    <w:lvl w:ilvl="0" w:tplc="08090001">
+      <w:start w:val="1"/>
+      <w:numFmt w:val="bullet"/>
+      <w:lvlText w:val=""/>
+      <w:lvlJc w:val="left"/>
+      <w:pPr>
+        <w:ind w:left="720" w:hanging="360"/>
+      </w:pPr>
+      <w:rPr>
+        <w:rFonts w:ascii="Symbol" w:hAnsi="Symbol" w:hint="default"/>
+      </w:rPr>
+    </w:lvl>
+    <w:lvl w:ilvl="1" w:tplc="08090003" w:tentative="1">
+      <w:start w:val="1"/>
+      <w:numFmt w:val="bullet"/>
+      <w:lvlText w:val="o"/>
+      <w:lvlJc w:val="left"/>
+      <w:pPr>
+        <w:ind w:left="1440" w:hanging="360"/>
+      </w:pPr>
+      <w:rPr>
+        <w:rFonts w:ascii="Courier New" w:hAnsi="Courier New" w:cs="Courier New" w:hint="default"/>
+      </w:rPr>
+    </w:lvl>
+    <w:lvl w:ilvl="2" w:tplc="08090005" w:tentative="1">
+      <w:start w:val="1"/>
+      <w:numFmt w:val="bullet"/>
+      <w:lvlText w:val=""/>
+      <w:lvlJc w:val="left"/>
+      <w:pPr>
+        <w:ind w:left="2160" w:hanging="360"/>
+      </w:pPr>
+      <w:rPr>
+        <w:rFonts w:ascii="Wingdings" w:hAnsi="Wingdings" w:hint="default"/>
+      </w:rPr>
+    </w:lvl>
+    <w:lvl w:ilvl="3" w:tplc="08090001" w:tentative="1">
+      <w:start w:val="1"/>
+      <w:numFmt w:val="bullet"/>
+      <w:lvlText w:val=""/>
+      <w:lvlJc w:val="left"/>
+      <w:pPr>
+        <w:ind w:left="2880" w:hanging="360"/>
+      </w:pPr>
+      <w:rPr>
+        <w:rFonts w:ascii="Symbol" w:hAnsi="Symbol" w:hint="default"/>
+      </w:rPr>
+    </w:lvl>
+    <w:lvl w:ilvl="4" w:tplc="08090003" w:tentative="1">
+      <w:start w:val="1"/>
+      <w:numFmt w:val="bullet"/>
+      <w:lvlText w:val="o"/>
+      <w:lvlJc w:val="left"/>
+      <w:pPr>
+        <w:ind w:left="3600" w:hanging="360"/>
+      </w:pPr>
+      <w:rPr>
+        <w:rFonts w:ascii="Courier New" w:hAnsi="Courier New" w:cs="Courier New" w:hint="default"/>
+      </w:rPr>
+    </w:lvl>
+    <w:lvl w:ilvl="5" w:tplc="08090005" w:tentative="1">
+      <w:start w:val="1"/>
+      <w:numFmt w:val="bullet"/>
+      <w:lvlText w:val=""/>
+      <w:lvlJc w:val="left"/>
+      <w:pPr>
+        <w:ind w:left="4320" w:hanging="360"/>
+      </w:pPr>
+      <w:rPr>
+        <w:rFonts w:ascii="Wingdings" w:hAnsi="Wingdings" w:hint="default"/>
+      </w:rPr>
+    </w:lvl>
+    <w:lvl w:ilvl="6" w:tplc="08090001" w:tentative="1">
+      <w:start w:val="1"/>
+      <w:numFmt w:val="bullet"/>
+      <w:lvlText w:val=""/>
+      <w:lvlJc w:val="left"/>
+      <w:pPr>
+        <w:ind w:left="5040" w:hanging="360"/>
+      </w:pPr>
+      <w:rPr>
+        <w:rFonts w:ascii="Symbol" w:hAnsi="Symbol" w:hint="default"/>
+      </w:rPr>
+    </w:lvl>
+    <w:lvl w:ilvl="7" w:tplc="08090003" w:tentative="1">
+      <w:start w:val="1"/>
+      <w:numFmt w:val="bullet"/>
+      <w:lvlText w:val="o"/>
+      <w:lvlJc w:val="left"/>
+      <w:pPr>
+        <w:ind w:left="5760" w:hanging="360"/>
+      </w:pPr>
+      <w:rPr>
+        <w:rFonts w:ascii="Courier New" w:hAnsi="Courier New" w:cs="Courier New" w:hint="default"/>
+      </w:rPr>
+    </w:lvl>
+    <w:lvl w:ilvl="8" w:tplc="08090005" w:tentative="1">
+      <w:start w:val="1"/>
+      <w:numFmt w:val="bullet"/>
+      <w:lvlText w:val=""/>
+      <w:lvlJc w:val="left"/>
+      <w:pPr>
+        <w:ind w:left="6480" w:hanging="360"/>
+      </w:pPr>
+      <w:rPr>
+        <w:rFonts w:ascii="Wingdings" w:hAnsi="Wingdings" w:hint="default"/>
+      </w:rPr>
+    </w:lvl>
+  </w:abstractNum>
   <w:num w:numId="1" w16cid:durableId="151021303">
-    <w:abstractNumId w:val="2"/>
+    <w:abstractNumId w:val="3"/>
   </w:num>
   <w:num w:numId="2" w16cid:durableId="795874596">
     <w:abstractNumId w:val="0"/>
   </w:num>
   <w:num w:numId="3" w16cid:durableId="1909993036">
-    <w:abstractNumId w:val="3"/>
+    <w:abstractNumId w:val="5"/>
   </w:num>
   <w:num w:numId="4" w16cid:durableId="1801722255">
     <w:abstractNumId w:val="1"/>
+  </w:num>
+  <w:num w:numId="5" w16cid:durableId="1115441735">
+    <w:abstractNumId w:val="4"/>
+  </w:num>
+  <w:num w:numId="6" w16cid:durableId="949124453">
+    <w:abstractNumId w:val="2"/>
+  </w:num>
+  <w:num w:numId="7" w16cid:durableId="400755117">
+    <w:abstractNumId w:val="6"/>
   </w:num>
 </w:numbering>
 </file>
@@ -1632,7 +1962,6 @@
   <w:style w:type="character" w:default="1" w:styleId="DefaultParagraphFont">
     <w:name w:val="Default Paragraph Font"/>
     <w:uiPriority w:val="1"/>
-    <w:semiHidden/>
     <w:unhideWhenUsed/>
   </w:style>
   <w:style w:type="table" w:default="1" w:styleId="TableNormal">
@@ -1944,6 +2273,15 @@
       <w:color w:val="2F5496" w:themeColor="accent1" w:themeShade="BF"/>
       <w:spacing w:val="5"/>
     </w:rPr>
+  </w:style>
+  <w:style w:type="paragraph" w:styleId="NoSpacing">
+    <w:name w:val="No Spacing"/>
+    <w:uiPriority w:val="1"/>
+    <w:qFormat/>
+    <w:rsid w:val="008B7B9E"/>
+    <w:pPr>
+      <w:spacing w:after="0" w:line="240" w:lineRule="auto"/>
+    </w:pPr>
   </w:style>
 </w:styles>
 </file>

</xml_diff>

<commit_message>
Remove RMB pan hint and update GDD
Simplify the fullscreen map hint text in Exit Strategy/UI.cpp by removing the 'RMB drag to pan' instruction — only 'Scroll to zoom' and 'Press M to close map' are shown now. Also includes an updated binary Game Design Document Abstract.docx (GDD) revision.
</commit_message>
<xml_diff>
--- a/GDD/Game Design Document Abstract.docx
+++ b/GDD/Game Design Document Abstract.docx
@@ -111,7 +111,7 @@
         <w:pStyle w:val="Heading2"/>
       </w:pPr>
       <w:r>
-        <w:t>Game Modes</w:t>
+        <w:t>Game Mode</w:t>
       </w:r>
     </w:p>
     <w:p>
@@ -201,106 +201,12 @@
       </w:pPr>
     </w:p>
     <w:p>
-      <w:r>
-        <w:rPr>
-          <w:b/>
-          <w:bCs/>
-        </w:rPr>
+      <w:pPr>
+        <w:pStyle w:val="Heading2"/>
+      </w:pPr>
+      <w:r>
         <w:lastRenderedPageBreak/>
-        <w:t>Endless Mode</w:t>
-      </w:r>
-      <w:r>
-        <w:rPr>
-          <w:b/>
-          <w:bCs/>
-        </w:rPr>
-        <w:br/>
-      </w:r>
-      <w:r>
-        <w:t xml:space="preserve">Endless Mode focuses on </w:t>
-      </w:r>
-      <w:proofErr w:type="spellStart"/>
-      <w:r>
-        <w:t>replayability</w:t>
-      </w:r>
-      <w:proofErr w:type="spellEnd"/>
-      <w:r>
-        <w:t xml:space="preserve"> through procedurally generated mazes.</w:t>
-      </w:r>
-    </w:p>
-    <w:p>
-      <w:pPr>
-        <w:pStyle w:val="NoSpacing"/>
-      </w:pPr>
-      <w:r>
-        <w:t>Each time the player escapes a maze, the next maze becomes:</w:t>
-      </w:r>
-    </w:p>
-    <w:p>
-      <w:pPr>
-        <w:pStyle w:val="NoSpacing"/>
-        <w:numPr>
-          <w:ilvl w:val="0"/>
-          <w:numId w:val="9"/>
-        </w:numPr>
-      </w:pPr>
-      <w:r>
-        <w:t>larger</w:t>
-      </w:r>
-    </w:p>
-    <w:p>
-      <w:pPr>
-        <w:pStyle w:val="NoSpacing"/>
-        <w:numPr>
-          <w:ilvl w:val="0"/>
-          <w:numId w:val="9"/>
-        </w:numPr>
-      </w:pPr>
-      <w:r>
-        <w:t>more complex</w:t>
-      </w:r>
-    </w:p>
-    <w:p>
-      <w:pPr>
-        <w:pStyle w:val="NoSpacing"/>
-        <w:numPr>
-          <w:ilvl w:val="0"/>
-          <w:numId w:val="9"/>
-        </w:numPr>
-      </w:pPr>
-      <w:r>
-        <w:t>populated with additional guards</w:t>
-      </w:r>
-    </w:p>
-    <w:p>
-      <w:pPr>
-        <w:pStyle w:val="NoSpacing"/>
-      </w:pPr>
-    </w:p>
-    <w:p>
-      <w:r>
-        <w:t>The player attempts to survive and escape as many mazes as possible.</w:t>
-      </w:r>
-    </w:p>
-    <w:p>
-      <w:r>
-        <w:t xml:space="preserve">This mode encourages </w:t>
-      </w:r>
-      <w:proofErr w:type="spellStart"/>
-      <w:r>
-        <w:t>replayability</w:t>
-      </w:r>
-      <w:proofErr w:type="spellEnd"/>
-      <w:r>
-        <w:t xml:space="preserve"> while testing the player’s navigation and stealth skills.</w:t>
-      </w:r>
-    </w:p>
-    <w:p>
-      <w:pPr>
-        <w:pStyle w:val="Heading2"/>
-      </w:pPr>
-      <w:r>
-        <w:t>Level Progression (Story Mode)</w:t>
+        <w:t xml:space="preserve">Level Progression </w:t>
       </w:r>
     </w:p>
     <w:tbl>
@@ -652,7 +558,19 @@
     </w:p>
     <w:p>
       <w:r>
-        <w:t>The story of Exit Strategy is delivered through short comic-style panels displayed between levels.</w:t>
+        <w:t xml:space="preserve">The story of Exit Strategy is delivered through short panels displayed </w:t>
+      </w:r>
+      <w:r>
+        <w:t xml:space="preserve">before </w:t>
+      </w:r>
+      <w:r>
+        <w:t>level</w:t>
+      </w:r>
+      <w:r>
+        <w:t xml:space="preserve"> 1 and after completing level 4</w:t>
+      </w:r>
+      <w:r>
+        <w:t>.</w:t>
       </w:r>
     </w:p>
     <w:p>
@@ -788,10 +706,13 @@
         </w:numPr>
       </w:pPr>
       <w:r>
-        <w:t>Use Power</w:t>
-      </w:r>
-      <w:r>
-        <w:t xml:space="preserve"> Cells to temporarily stun/blind the guards if spotted.</w:t>
+        <w:t xml:space="preserve">Use </w:t>
+      </w:r>
+      <w:r>
+        <w:t>Taser</w:t>
+      </w:r>
+      <w:r>
+        <w:t xml:space="preserve"> to temporarily stun/blind the guards if spotted.</w:t>
       </w:r>
     </w:p>
     <w:p>
@@ -803,7 +724,10 @@
         </w:numPr>
       </w:pPr>
       <w:r>
-        <w:t>After all keys are collected, the Exit Gate unlocks.</w:t>
+        <w:t xml:space="preserve">Collect Power Cell </w:t>
+      </w:r>
+      <w:r>
+        <w:t>for another taser ammo.</w:t>
       </w:r>
     </w:p>
     <w:p>
@@ -815,6 +739,18 @@
         </w:numPr>
       </w:pPr>
       <w:r>
+        <w:t>After all keys are collected, the Exit Gate unlocks.</w:t>
+      </w:r>
+    </w:p>
+    <w:p>
+      <w:pPr>
+        <w:pStyle w:val="ListParagraph"/>
+        <w:numPr>
+          <w:ilvl w:val="0"/>
+          <w:numId w:val="5"/>
+        </w:numPr>
+      </w:pPr>
+      <w:r>
         <w:t>Reach the Exit Gate to complete the level.</w:t>
       </w:r>
     </w:p>
@@ -828,7 +764,6 @@
         <w:pStyle w:val="Heading2"/>
       </w:pPr>
       <w:r>
-        <w:lastRenderedPageBreak/>
         <w:t>Game</w:t>
       </w:r>
       <w:r>
@@ -934,6 +869,7 @@
         </w:numPr>
       </w:pPr>
       <w:r>
+        <w:lastRenderedPageBreak/>
         <w:t>Built from a 2D grid loaded via XML</w:t>
       </w:r>
     </w:p>
@@ -1007,6 +943,18 @@
       </w:pPr>
       <w:r>
         <w:t>5 = Power Cell</w:t>
+      </w:r>
+    </w:p>
+    <w:p>
+      <w:pPr>
+        <w:pStyle w:val="NoSpacing"/>
+        <w:numPr>
+          <w:ilvl w:val="0"/>
+          <w:numId w:val="7"/>
+        </w:numPr>
+      </w:pPr>
+      <w:r>
+        <w:t>6 = Taser</w:t>
       </w:r>
     </w:p>
     <w:p>
@@ -1159,7 +1107,13 @@
         <w:t xml:space="preserve">: </w:t>
       </w:r>
       <w:r>
-        <w:t>A playable FPS maze level featuring player movement, collectible Exit Keys, at least one NPC guard with patrol and chase behaviour, a Power Cell mechanic, and a functional Exit Gate to complete the level.</w:t>
+        <w:t xml:space="preserve">A playable FPS maze level featuring player movement, collectible Exit Keys, at least one NPC guard with patrol and chase behaviour, a </w:t>
+      </w:r>
+      <w:r>
+        <w:t xml:space="preserve">Taser </w:t>
+      </w:r>
+      <w:r>
+        <w:t>mechanic, and a functional Exit Gate to complete the level.</w:t>
       </w:r>
     </w:p>
     <w:sectPr>
@@ -2915,6 +2869,7 @@
   <w:style w:type="character" w:default="1" w:styleId="DefaultParagraphFont">
     <w:name w:val="Default Paragraph Font"/>
     <w:uiPriority w:val="1"/>
+    <w:semiHidden/>
     <w:unhideWhenUsed/>
   </w:style>
   <w:style w:type="table" w:default="1" w:styleId="TableNormal">

</xml_diff>